<commit_message>
added page numbers to both Word and PDF docu.
</commit_message>
<xml_diff>
--- a/SENG696 - Ayah Metwali Report 1.docx
+++ b/SENG696 - Ayah Metwali Report 1.docx
@@ -676,6 +676,9 @@
     </w:p>
     <w:p>
       <w:r>
+        <w:rPr>
+          <w:noProof/>
+        </w:rPr>
         <w:lastRenderedPageBreak/>
         <w:drawing>
           <wp:inline distT="0" distB="0" distL="0" distR="0" wp14:anchorId="260476CF" wp14:editId="155B164F">
@@ -1398,12 +1401,6 @@
         <w:gridCol w:w="3400"/>
       </w:tblGrid>
       <w:tr>
-        <w:tblPrEx>
-          <w:tblCellMar>
-            <w:top w:w="0" w:type="dxa"/>
-            <w:bottom w:w="0" w:type="dxa"/>
-          </w:tblCellMar>
-        </w:tblPrEx>
         <w:trPr>
           <w:tblHeader/>
         </w:trPr>
@@ -1502,12 +1499,6 @@
         </w:tc>
       </w:tr>
       <w:tr>
-        <w:tblPrEx>
-          <w:tblCellMar>
-            <w:top w:w="0" w:type="dxa"/>
-            <w:bottom w:w="0" w:type="dxa"/>
-          </w:tblCellMar>
-        </w:tblPrEx>
         <w:tc>
           <w:tcPr>
             <w:tcW w:w="2600" w:type="dxa"/>
@@ -1600,12 +1591,6 @@
         </w:tc>
       </w:tr>
       <w:tr>
-        <w:tblPrEx>
-          <w:tblCellMar>
-            <w:top w:w="0" w:type="dxa"/>
-            <w:bottom w:w="0" w:type="dxa"/>
-          </w:tblCellMar>
-        </w:tblPrEx>
         <w:tc>
           <w:tcPr>
             <w:tcW w:w="2600" w:type="dxa"/>
@@ -1686,12 +1671,6 @@
         </w:tc>
       </w:tr>
       <w:tr>
-        <w:tblPrEx>
-          <w:tblCellMar>
-            <w:top w:w="0" w:type="dxa"/>
-            <w:bottom w:w="0" w:type="dxa"/>
-          </w:tblCellMar>
-        </w:tblPrEx>
         <w:tc>
           <w:tcPr>
             <w:tcW w:w="2600" w:type="dxa"/>
@@ -1802,12 +1781,6 @@
         </w:tc>
       </w:tr>
       <w:tr>
-        <w:tblPrEx>
-          <w:tblCellMar>
-            <w:top w:w="0" w:type="dxa"/>
-            <w:bottom w:w="0" w:type="dxa"/>
-          </w:tblCellMar>
-        </w:tblPrEx>
         <w:tc>
           <w:tcPr>
             <w:tcW w:w="2600" w:type="dxa"/>
@@ -1918,12 +1891,6 @@
         <w:gridCol w:w="6622"/>
       </w:tblGrid>
       <w:tr>
-        <w:tblPrEx>
-          <w:tblCellMar>
-            <w:top w:w="0" w:type="dxa"/>
-            <w:bottom w:w="0" w:type="dxa"/>
-          </w:tblCellMar>
-        </w:tblPrEx>
         <w:tc>
           <w:tcPr>
             <w:tcW w:w="2666" w:type="dxa"/>
@@ -2005,12 +1972,6 @@
         </w:tc>
       </w:tr>
       <w:tr>
-        <w:tblPrEx>
-          <w:tblCellMar>
-            <w:top w:w="0" w:type="dxa"/>
-            <w:bottom w:w="0" w:type="dxa"/>
-          </w:tblCellMar>
-        </w:tblPrEx>
         <w:tc>
           <w:tcPr>
             <w:tcW w:w="2666" w:type="dxa"/>
@@ -2065,12 +2026,6 @@
         </w:tc>
       </w:tr>
       <w:tr>
-        <w:tblPrEx>
-          <w:tblCellMar>
-            <w:top w:w="0" w:type="dxa"/>
-            <w:bottom w:w="0" w:type="dxa"/>
-          </w:tblCellMar>
-        </w:tblPrEx>
         <w:tc>
           <w:tcPr>
             <w:tcW w:w="2666" w:type="dxa"/>
@@ -2181,12 +2136,6 @@
         </w:tc>
       </w:tr>
       <w:tr>
-        <w:tblPrEx>
-          <w:tblCellMar>
-            <w:top w:w="0" w:type="dxa"/>
-            <w:bottom w:w="0" w:type="dxa"/>
-          </w:tblCellMar>
-        </w:tblPrEx>
         <w:tc>
           <w:tcPr>
             <w:tcW w:w="2666" w:type="dxa"/>
@@ -2287,12 +2236,6 @@
         </w:tc>
       </w:tr>
       <w:tr>
-        <w:tblPrEx>
-          <w:tblCellMar>
-            <w:top w:w="0" w:type="dxa"/>
-            <w:bottom w:w="0" w:type="dxa"/>
-          </w:tblCellMar>
-        </w:tblPrEx>
         <w:tc>
           <w:tcPr>
             <w:tcW w:w="1413" w:type="dxa"/>
@@ -2499,12 +2442,6 @@
         </w:tc>
       </w:tr>
       <w:tr>
-        <w:tblPrEx>
-          <w:tblCellMar>
-            <w:top w:w="0" w:type="dxa"/>
-            <w:bottom w:w="0" w:type="dxa"/>
-          </w:tblCellMar>
-        </w:tblPrEx>
         <w:tc>
           <w:tcPr>
             <w:tcW w:w="1333" w:type="dxa"/>
@@ -2596,12 +2533,6 @@
         <w:gridCol w:w="6684"/>
       </w:tblGrid>
       <w:tr>
-        <w:tblPrEx>
-          <w:tblCellMar>
-            <w:top w:w="0" w:type="dxa"/>
-            <w:bottom w:w="0" w:type="dxa"/>
-          </w:tblCellMar>
-        </w:tblPrEx>
         <w:tc>
           <w:tcPr>
             <w:tcW w:w="2666" w:type="dxa"/>
@@ -2693,12 +2624,6 @@
         </w:tc>
       </w:tr>
       <w:tr>
-        <w:tblPrEx>
-          <w:tblCellMar>
-            <w:top w:w="0" w:type="dxa"/>
-            <w:bottom w:w="0" w:type="dxa"/>
-          </w:tblCellMar>
-        </w:tblPrEx>
         <w:tc>
           <w:tcPr>
             <w:tcW w:w="2666" w:type="dxa"/>
@@ -2753,12 +2678,6 @@
         </w:tc>
       </w:tr>
       <w:tr>
-        <w:tblPrEx>
-          <w:tblCellMar>
-            <w:top w:w="0" w:type="dxa"/>
-            <w:bottom w:w="0" w:type="dxa"/>
-          </w:tblCellMar>
-        </w:tblPrEx>
         <w:tc>
           <w:tcPr>
             <w:tcW w:w="2666" w:type="dxa"/>
@@ -2815,12 +2734,6 @@
         </w:tc>
       </w:tr>
       <w:tr>
-        <w:tblPrEx>
-          <w:tblCellMar>
-            <w:top w:w="0" w:type="dxa"/>
-            <w:bottom w:w="0" w:type="dxa"/>
-          </w:tblCellMar>
-        </w:tblPrEx>
         <w:tc>
           <w:tcPr>
             <w:tcW w:w="2666" w:type="dxa"/>
@@ -2921,12 +2834,6 @@
         </w:tc>
       </w:tr>
       <w:tr>
-        <w:tblPrEx>
-          <w:tblCellMar>
-            <w:top w:w="0" w:type="dxa"/>
-            <w:bottom w:w="0" w:type="dxa"/>
-          </w:tblCellMar>
-        </w:tblPrEx>
         <w:tc>
           <w:tcPr>
             <w:tcW w:w="1481" w:type="dxa"/>
@@ -3049,12 +2956,6 @@
         </w:tc>
       </w:tr>
       <w:tr>
-        <w:tblPrEx>
-          <w:tblCellMar>
-            <w:top w:w="0" w:type="dxa"/>
-            <w:bottom w:w="0" w:type="dxa"/>
-          </w:tblCellMar>
-        </w:tblPrEx>
         <w:tc>
           <w:tcPr>
             <w:tcW w:w="1333" w:type="dxa"/>
@@ -3146,12 +3047,6 @@
         <w:gridCol w:w="6720"/>
       </w:tblGrid>
       <w:tr>
-        <w:tblPrEx>
-          <w:tblCellMar>
-            <w:top w:w="0" w:type="dxa"/>
-            <w:bottom w:w="0" w:type="dxa"/>
-          </w:tblCellMar>
-        </w:tblPrEx>
         <w:tc>
           <w:tcPr>
             <w:tcW w:w="2629" w:type="dxa"/>
@@ -3230,12 +3125,6 @@
         </w:tc>
       </w:tr>
       <w:tr>
-        <w:tblPrEx>
-          <w:tblCellMar>
-            <w:top w:w="0" w:type="dxa"/>
-            <w:bottom w:w="0" w:type="dxa"/>
-          </w:tblCellMar>
-        </w:tblPrEx>
         <w:tc>
           <w:tcPr>
             <w:tcW w:w="2629" w:type="dxa"/>
@@ -3290,12 +3179,6 @@
         </w:tc>
       </w:tr>
       <w:tr>
-        <w:tblPrEx>
-          <w:tblCellMar>
-            <w:top w:w="0" w:type="dxa"/>
-            <w:bottom w:w="0" w:type="dxa"/>
-          </w:tblCellMar>
-        </w:tblPrEx>
         <w:tc>
           <w:tcPr>
             <w:tcW w:w="2629" w:type="dxa"/>
@@ -3388,12 +3271,6 @@
         </w:tc>
       </w:tr>
       <w:tr>
-        <w:tblPrEx>
-          <w:tblCellMar>
-            <w:top w:w="0" w:type="dxa"/>
-            <w:bottom w:w="0" w:type="dxa"/>
-          </w:tblCellMar>
-        </w:tblPrEx>
         <w:tc>
           <w:tcPr>
             <w:tcW w:w="2629" w:type="dxa"/>
@@ -3494,12 +3371,6 @@
         </w:tc>
       </w:tr>
       <w:tr>
-        <w:tblPrEx>
-          <w:tblCellMar>
-            <w:top w:w="0" w:type="dxa"/>
-            <w:bottom w:w="0" w:type="dxa"/>
-          </w:tblCellMar>
-        </w:tblPrEx>
         <w:tc>
           <w:tcPr>
             <w:tcW w:w="1481" w:type="dxa"/>
@@ -3664,12 +3535,6 @@
         </w:tc>
       </w:tr>
       <w:tr>
-        <w:tblPrEx>
-          <w:tblCellMar>
-            <w:top w:w="0" w:type="dxa"/>
-            <w:bottom w:w="0" w:type="dxa"/>
-          </w:tblCellMar>
-        </w:tblPrEx>
         <w:tc>
           <w:tcPr>
             <w:tcW w:w="1314" w:type="dxa"/>
@@ -3757,12 +3622,6 @@
         <w:gridCol w:w="6723"/>
       </w:tblGrid>
       <w:tr>
-        <w:tblPrEx>
-          <w:tblCellMar>
-            <w:top w:w="0" w:type="dxa"/>
-            <w:bottom w:w="0" w:type="dxa"/>
-          </w:tblCellMar>
-        </w:tblPrEx>
         <w:tc>
           <w:tcPr>
             <w:tcW w:w="2627" w:type="dxa"/>
@@ -3854,12 +3713,6 @@
         </w:tc>
       </w:tr>
       <w:tr>
-        <w:tblPrEx>
-          <w:tblCellMar>
-            <w:top w:w="0" w:type="dxa"/>
-            <w:bottom w:w="0" w:type="dxa"/>
-          </w:tblCellMar>
-        </w:tblPrEx>
         <w:tc>
           <w:tcPr>
             <w:tcW w:w="2627" w:type="dxa"/>
@@ -3914,12 +3767,6 @@
         </w:tc>
       </w:tr>
       <w:tr>
-        <w:tblPrEx>
-          <w:tblCellMar>
-            <w:top w:w="0" w:type="dxa"/>
-            <w:bottom w:w="0" w:type="dxa"/>
-          </w:tblCellMar>
-        </w:tblPrEx>
         <w:tc>
           <w:tcPr>
             <w:tcW w:w="2627" w:type="dxa"/>
@@ -3976,12 +3823,6 @@
         </w:tc>
       </w:tr>
       <w:tr>
-        <w:tblPrEx>
-          <w:tblCellMar>
-            <w:top w:w="0" w:type="dxa"/>
-            <w:bottom w:w="0" w:type="dxa"/>
-          </w:tblCellMar>
-        </w:tblPrEx>
         <w:tc>
           <w:tcPr>
             <w:tcW w:w="2627" w:type="dxa"/>
@@ -4082,12 +3923,6 @@
         </w:tc>
       </w:tr>
       <w:tr>
-        <w:tblPrEx>
-          <w:tblCellMar>
-            <w:top w:w="0" w:type="dxa"/>
-            <w:bottom w:w="0" w:type="dxa"/>
-          </w:tblCellMar>
-        </w:tblPrEx>
         <w:tc>
           <w:tcPr>
             <w:tcW w:w="1481" w:type="dxa"/>
@@ -4196,12 +4031,6 @@
         </w:tc>
       </w:tr>
       <w:tr>
-        <w:tblPrEx>
-          <w:tblCellMar>
-            <w:top w:w="0" w:type="dxa"/>
-            <w:bottom w:w="0" w:type="dxa"/>
-          </w:tblCellMar>
-        </w:tblPrEx>
         <w:tc>
           <w:tcPr>
             <w:tcW w:w="1313" w:type="dxa"/>
@@ -4289,12 +4118,6 @@
         <w:gridCol w:w="6719"/>
       </w:tblGrid>
       <w:tr>
-        <w:tblPrEx>
-          <w:tblCellMar>
-            <w:top w:w="0" w:type="dxa"/>
-            <w:bottom w:w="0" w:type="dxa"/>
-          </w:tblCellMar>
-        </w:tblPrEx>
         <w:tc>
           <w:tcPr>
             <w:tcW w:w="2630" w:type="dxa"/>
@@ -4386,12 +4209,6 @@
         </w:tc>
       </w:tr>
       <w:tr>
-        <w:tblPrEx>
-          <w:tblCellMar>
-            <w:top w:w="0" w:type="dxa"/>
-            <w:bottom w:w="0" w:type="dxa"/>
-          </w:tblCellMar>
-        </w:tblPrEx>
         <w:tc>
           <w:tcPr>
             <w:tcW w:w="2630" w:type="dxa"/>
@@ -4446,12 +4263,6 @@
         </w:tc>
       </w:tr>
       <w:tr>
-        <w:tblPrEx>
-          <w:tblCellMar>
-            <w:top w:w="0" w:type="dxa"/>
-            <w:bottom w:w="0" w:type="dxa"/>
-          </w:tblCellMar>
-        </w:tblPrEx>
         <w:tc>
           <w:tcPr>
             <w:tcW w:w="2630" w:type="dxa"/>
@@ -4562,12 +4373,6 @@
         </w:tc>
       </w:tr>
       <w:tr>
-        <w:tblPrEx>
-          <w:tblCellMar>
-            <w:top w:w="0" w:type="dxa"/>
-            <w:bottom w:w="0" w:type="dxa"/>
-          </w:tblCellMar>
-        </w:tblPrEx>
         <w:tc>
           <w:tcPr>
             <w:tcW w:w="2630" w:type="dxa"/>
@@ -4668,12 +4473,6 @@
         </w:tc>
       </w:tr>
       <w:tr>
-        <w:tblPrEx>
-          <w:tblCellMar>
-            <w:top w:w="0" w:type="dxa"/>
-            <w:bottom w:w="0" w:type="dxa"/>
-          </w:tblCellMar>
-        </w:tblPrEx>
         <w:tc>
           <w:tcPr>
             <w:tcW w:w="1481" w:type="dxa"/>
@@ -4844,12 +4643,6 @@
         </w:tc>
       </w:tr>
       <w:tr>
-        <w:tblPrEx>
-          <w:tblCellMar>
-            <w:top w:w="0" w:type="dxa"/>
-            <w:bottom w:w="0" w:type="dxa"/>
-          </w:tblCellMar>
-        </w:tblPrEx>
         <w:tc>
           <w:tcPr>
             <w:tcW w:w="1315" w:type="dxa"/>
@@ -4947,12 +4740,6 @@
         <w:gridCol w:w="6722"/>
       </w:tblGrid>
       <w:tr>
-        <w:tblPrEx>
-          <w:tblCellMar>
-            <w:top w:w="0" w:type="dxa"/>
-            <w:bottom w:w="0" w:type="dxa"/>
-          </w:tblCellMar>
-        </w:tblPrEx>
         <w:tc>
           <w:tcPr>
             <w:tcW w:w="2628" w:type="dxa"/>
@@ -5044,12 +4831,6 @@
         </w:tc>
       </w:tr>
       <w:tr>
-        <w:tblPrEx>
-          <w:tblCellMar>
-            <w:top w:w="0" w:type="dxa"/>
-            <w:bottom w:w="0" w:type="dxa"/>
-          </w:tblCellMar>
-        </w:tblPrEx>
         <w:tc>
           <w:tcPr>
             <w:tcW w:w="2628" w:type="dxa"/>
@@ -5140,12 +4921,6 @@
         </w:tc>
       </w:tr>
       <w:tr>
-        <w:tblPrEx>
-          <w:tblCellMar>
-            <w:top w:w="0" w:type="dxa"/>
-            <w:bottom w:w="0" w:type="dxa"/>
-          </w:tblCellMar>
-        </w:tblPrEx>
         <w:tc>
           <w:tcPr>
             <w:tcW w:w="2628" w:type="dxa"/>
@@ -5220,12 +4995,6 @@
         </w:tc>
       </w:tr>
       <w:tr>
-        <w:tblPrEx>
-          <w:tblCellMar>
-            <w:top w:w="0" w:type="dxa"/>
-            <w:bottom w:w="0" w:type="dxa"/>
-          </w:tblCellMar>
-        </w:tblPrEx>
         <w:tc>
           <w:tcPr>
             <w:tcW w:w="2628" w:type="dxa"/>
@@ -5326,12 +5095,6 @@
         </w:tc>
       </w:tr>
       <w:tr>
-        <w:tblPrEx>
-          <w:tblCellMar>
-            <w:top w:w="0" w:type="dxa"/>
-            <w:bottom w:w="0" w:type="dxa"/>
-          </w:tblCellMar>
-        </w:tblPrEx>
         <w:tc>
           <w:tcPr>
             <w:tcW w:w="1481" w:type="dxa"/>
@@ -5486,12 +5249,6 @@
         </w:tc>
       </w:tr>
       <w:tr>
-        <w:tblPrEx>
-          <w:tblCellMar>
-            <w:top w:w="0" w:type="dxa"/>
-            <w:bottom w:w="0" w:type="dxa"/>
-          </w:tblCellMar>
-        </w:tblPrEx>
         <w:tc>
           <w:tcPr>
             <w:tcW w:w="1314" w:type="dxa"/>
@@ -5579,12 +5336,6 @@
         <w:gridCol w:w="6722"/>
       </w:tblGrid>
       <w:tr>
-        <w:tblPrEx>
-          <w:tblCellMar>
-            <w:top w:w="0" w:type="dxa"/>
-            <w:bottom w:w="0" w:type="dxa"/>
-          </w:tblCellMar>
-        </w:tblPrEx>
         <w:tc>
           <w:tcPr>
             <w:tcW w:w="2628" w:type="dxa"/>
@@ -5663,12 +5414,6 @@
         </w:tc>
       </w:tr>
       <w:tr>
-        <w:tblPrEx>
-          <w:tblCellMar>
-            <w:top w:w="0" w:type="dxa"/>
-            <w:bottom w:w="0" w:type="dxa"/>
-          </w:tblCellMar>
-        </w:tblPrEx>
         <w:tc>
           <w:tcPr>
             <w:tcW w:w="2628" w:type="dxa"/>
@@ -5723,12 +5468,6 @@
         </w:tc>
       </w:tr>
       <w:tr>
-        <w:tblPrEx>
-          <w:tblCellMar>
-            <w:top w:w="0" w:type="dxa"/>
-            <w:bottom w:w="0" w:type="dxa"/>
-          </w:tblCellMar>
-        </w:tblPrEx>
         <w:tc>
           <w:tcPr>
             <w:tcW w:w="2628" w:type="dxa"/>
@@ -5785,12 +5524,6 @@
         </w:tc>
       </w:tr>
       <w:tr>
-        <w:tblPrEx>
-          <w:tblCellMar>
-            <w:top w:w="0" w:type="dxa"/>
-            <w:bottom w:w="0" w:type="dxa"/>
-          </w:tblCellMar>
-        </w:tblPrEx>
         <w:tc>
           <w:tcPr>
             <w:tcW w:w="2628" w:type="dxa"/>
@@ -5891,12 +5624,6 @@
         </w:tc>
       </w:tr>
       <w:tr>
-        <w:tblPrEx>
-          <w:tblCellMar>
-            <w:top w:w="0" w:type="dxa"/>
-            <w:bottom w:w="0" w:type="dxa"/>
-          </w:tblCellMar>
-        </w:tblPrEx>
         <w:tc>
           <w:tcPr>
             <w:tcW w:w="1481" w:type="dxa"/>
@@ -6005,12 +5732,6 @@
         </w:tc>
       </w:tr>
       <w:tr>
-        <w:tblPrEx>
-          <w:tblCellMar>
-            <w:top w:w="0" w:type="dxa"/>
-            <w:bottom w:w="0" w:type="dxa"/>
-          </w:tblCellMar>
-        </w:tblPrEx>
         <w:tc>
           <w:tcPr>
             <w:tcW w:w="1314" w:type="dxa"/>
@@ -6134,12 +5855,6 @@
         <w:gridCol w:w="6724"/>
       </w:tblGrid>
       <w:tr>
-        <w:tblPrEx>
-          <w:tblCellMar>
-            <w:top w:w="0" w:type="dxa"/>
-            <w:bottom w:w="0" w:type="dxa"/>
-          </w:tblCellMar>
-        </w:tblPrEx>
         <w:tc>
           <w:tcPr>
             <w:tcW w:w="2626" w:type="dxa"/>
@@ -6205,12 +5920,6 @@
         </w:tc>
       </w:tr>
       <w:tr>
-        <w:tblPrEx>
-          <w:tblCellMar>
-            <w:top w:w="0" w:type="dxa"/>
-            <w:bottom w:w="0" w:type="dxa"/>
-          </w:tblCellMar>
-        </w:tblPrEx>
         <w:tc>
           <w:tcPr>
             <w:tcW w:w="2626" w:type="dxa"/>
@@ -6265,12 +5974,6 @@
         </w:tc>
       </w:tr>
       <w:tr>
-        <w:tblPrEx>
-          <w:tblCellMar>
-            <w:top w:w="0" w:type="dxa"/>
-            <w:bottom w:w="0" w:type="dxa"/>
-          </w:tblCellMar>
-        </w:tblPrEx>
         <w:tc>
           <w:tcPr>
             <w:tcW w:w="2626" w:type="dxa"/>
@@ -6345,12 +6048,6 @@
         </w:tc>
       </w:tr>
       <w:tr>
-        <w:tblPrEx>
-          <w:tblCellMar>
-            <w:top w:w="0" w:type="dxa"/>
-            <w:bottom w:w="0" w:type="dxa"/>
-          </w:tblCellMar>
-        </w:tblPrEx>
         <w:tc>
           <w:tcPr>
             <w:tcW w:w="2626" w:type="dxa"/>
@@ -6415,12 +6112,6 @@
         </w:tc>
       </w:tr>
       <w:tr>
-        <w:tblPrEx>
-          <w:tblCellMar>
-            <w:top w:w="0" w:type="dxa"/>
-            <w:bottom w:w="0" w:type="dxa"/>
-          </w:tblCellMar>
-        </w:tblPrEx>
         <w:tc>
           <w:tcPr>
             <w:tcW w:w="1481" w:type="dxa"/>
@@ -6567,12 +6258,6 @@
         </w:tc>
       </w:tr>
       <w:tr>
-        <w:tblPrEx>
-          <w:tblCellMar>
-            <w:top w:w="0" w:type="dxa"/>
-            <w:bottom w:w="0" w:type="dxa"/>
-          </w:tblCellMar>
-        </w:tblPrEx>
         <w:tc>
           <w:tcPr>
             <w:tcW w:w="1313" w:type="dxa"/>
@@ -6660,12 +6345,6 @@
         <w:gridCol w:w="6725"/>
       </w:tblGrid>
       <w:tr>
-        <w:tblPrEx>
-          <w:tblCellMar>
-            <w:top w:w="0" w:type="dxa"/>
-            <w:bottom w:w="0" w:type="dxa"/>
-          </w:tblCellMar>
-        </w:tblPrEx>
         <w:tc>
           <w:tcPr>
             <w:tcW w:w="2625" w:type="dxa"/>
@@ -6755,12 +6434,6 @@
         </w:tc>
       </w:tr>
       <w:tr>
-        <w:tblPrEx>
-          <w:tblCellMar>
-            <w:top w:w="0" w:type="dxa"/>
-            <w:bottom w:w="0" w:type="dxa"/>
-          </w:tblCellMar>
-        </w:tblPrEx>
         <w:tc>
           <w:tcPr>
             <w:tcW w:w="2625" w:type="dxa"/>
@@ -6815,12 +6488,6 @@
         </w:tc>
       </w:tr>
       <w:tr>
-        <w:tblPrEx>
-          <w:tblCellMar>
-            <w:top w:w="0" w:type="dxa"/>
-            <w:bottom w:w="0" w:type="dxa"/>
-          </w:tblCellMar>
-        </w:tblPrEx>
         <w:tc>
           <w:tcPr>
             <w:tcW w:w="2625" w:type="dxa"/>
@@ -6877,12 +6544,6 @@
         </w:tc>
       </w:tr>
       <w:tr>
-        <w:tblPrEx>
-          <w:tblCellMar>
-            <w:top w:w="0" w:type="dxa"/>
-            <w:bottom w:w="0" w:type="dxa"/>
-          </w:tblCellMar>
-        </w:tblPrEx>
         <w:tc>
           <w:tcPr>
             <w:tcW w:w="2625" w:type="dxa"/>
@@ -6965,12 +6626,6 @@
         </w:tc>
       </w:tr>
       <w:tr>
-        <w:tblPrEx>
-          <w:tblCellMar>
-            <w:top w:w="0" w:type="dxa"/>
-            <w:bottom w:w="0" w:type="dxa"/>
-          </w:tblCellMar>
-        </w:tblPrEx>
         <w:tc>
           <w:tcPr>
             <w:tcW w:w="1481" w:type="dxa"/>
@@ -7089,12 +6744,6 @@
         </w:tc>
       </w:tr>
       <w:tr>
-        <w:tblPrEx>
-          <w:tblCellMar>
-            <w:top w:w="0" w:type="dxa"/>
-            <w:bottom w:w="0" w:type="dxa"/>
-          </w:tblCellMar>
-        </w:tblPrEx>
         <w:tc>
           <w:tcPr>
             <w:tcW w:w="1312" w:type="dxa"/>
@@ -7358,12 +7007,6 @@
         <w:gridCol w:w="1525"/>
       </w:tblGrid>
       <w:tr>
-        <w:tblPrEx>
-          <w:tblCellMar>
-            <w:top w:w="0" w:type="dxa"/>
-            <w:bottom w:w="0" w:type="dxa"/>
-          </w:tblCellMar>
-        </w:tblPrEx>
         <w:trPr>
           <w:tblHeader/>
         </w:trPr>
@@ -7555,12 +7198,6 @@
         </w:tc>
       </w:tr>
       <w:tr>
-        <w:tblPrEx>
-          <w:tblCellMar>
-            <w:top w:w="0" w:type="dxa"/>
-            <w:bottom w:w="0" w:type="dxa"/>
-          </w:tblCellMar>
-        </w:tblPrEx>
         <w:tc>
           <w:tcPr>
             <w:tcW w:w="1550" w:type="dxa"/>
@@ -7711,12 +7348,6 @@
         </w:tc>
       </w:tr>
       <w:tr>
-        <w:tblPrEx>
-          <w:tblCellMar>
-            <w:top w:w="0" w:type="dxa"/>
-            <w:bottom w:w="0" w:type="dxa"/>
-          </w:tblCellMar>
-        </w:tblPrEx>
         <w:tc>
           <w:tcPr>
             <w:tcW w:w="1550" w:type="dxa"/>
@@ -7867,12 +7498,6 @@
         </w:tc>
       </w:tr>
       <w:tr>
-        <w:tblPrEx>
-          <w:tblCellMar>
-            <w:top w:w="0" w:type="dxa"/>
-            <w:bottom w:w="0" w:type="dxa"/>
-          </w:tblCellMar>
-        </w:tblPrEx>
         <w:tc>
           <w:tcPr>
             <w:tcW w:w="1550" w:type="dxa"/>
@@ -8023,12 +7648,6 @@
         </w:tc>
       </w:tr>
       <w:tr>
-        <w:tblPrEx>
-          <w:tblCellMar>
-            <w:top w:w="0" w:type="dxa"/>
-            <w:bottom w:w="0" w:type="dxa"/>
-          </w:tblCellMar>
-        </w:tblPrEx>
         <w:tc>
           <w:tcPr>
             <w:tcW w:w="1550" w:type="dxa"/>
@@ -8181,12 +7800,6 @@
         </w:tc>
       </w:tr>
       <w:tr>
-        <w:tblPrEx>
-          <w:tblCellMar>
-            <w:top w:w="0" w:type="dxa"/>
-            <w:bottom w:w="0" w:type="dxa"/>
-          </w:tblCellMar>
-        </w:tblPrEx>
         <w:tc>
           <w:tcPr>
             <w:tcW w:w="1550" w:type="dxa"/>
@@ -8339,12 +7952,6 @@
         </w:tc>
       </w:tr>
       <w:tr>
-        <w:tblPrEx>
-          <w:tblCellMar>
-            <w:top w:w="0" w:type="dxa"/>
-            <w:bottom w:w="0" w:type="dxa"/>
-          </w:tblCellMar>
-        </w:tblPrEx>
         <w:tc>
           <w:tcPr>
             <w:tcW w:w="1550" w:type="dxa"/>
@@ -8495,12 +8102,6 @@
         </w:tc>
       </w:tr>
       <w:tr>
-        <w:tblPrEx>
-          <w:tblCellMar>
-            <w:top w:w="0" w:type="dxa"/>
-            <w:bottom w:w="0" w:type="dxa"/>
-          </w:tblCellMar>
-        </w:tblPrEx>
         <w:tc>
           <w:tcPr>
             <w:tcW w:w="1550" w:type="dxa"/>
@@ -8710,6 +8311,9 @@
     </w:p>
     <w:p>
       <w:r>
+        <w:rPr>
+          <w:noProof/>
+        </w:rPr>
         <w:drawing>
           <wp:inline distT="0" distB="0" distL="0" distR="0" wp14:anchorId="00A94605" wp14:editId="1F511D24">
             <wp:extent cx="5943600" cy="2466975"/>
@@ -8798,12 +8402,6 @@
         <w:gridCol w:w="1860"/>
       </w:tblGrid>
       <w:tr>
-        <w:tblPrEx>
-          <w:tblCellMar>
-            <w:top w:w="0" w:type="dxa"/>
-            <w:bottom w:w="0" w:type="dxa"/>
-          </w:tblCellMar>
-        </w:tblPrEx>
         <w:trPr>
           <w:tblHeader/>
         </w:trPr>
@@ -8964,12 +8562,6 @@
         </w:tc>
       </w:tr>
       <w:tr>
-        <w:tblPrEx>
-          <w:tblCellMar>
-            <w:top w:w="0" w:type="dxa"/>
-            <w:bottom w:w="0" w:type="dxa"/>
-          </w:tblCellMar>
-        </w:tblPrEx>
         <w:tc>
           <w:tcPr>
             <w:tcW w:w="1860" w:type="dxa"/>
@@ -9102,12 +8694,6 @@
         </w:tc>
       </w:tr>
       <w:tr>
-        <w:tblPrEx>
-          <w:tblCellMar>
-            <w:top w:w="0" w:type="dxa"/>
-            <w:bottom w:w="0" w:type="dxa"/>
-          </w:tblCellMar>
-        </w:tblPrEx>
         <w:tc>
           <w:tcPr>
             <w:tcW w:w="1860" w:type="dxa"/>
@@ -9268,12 +8854,6 @@
         </w:tc>
       </w:tr>
       <w:tr>
-        <w:tblPrEx>
-          <w:tblCellMar>
-            <w:top w:w="0" w:type="dxa"/>
-            <w:bottom w:w="0" w:type="dxa"/>
-          </w:tblCellMar>
-        </w:tblPrEx>
         <w:tc>
           <w:tcPr>
             <w:tcW w:w="1860" w:type="dxa"/>
@@ -9424,12 +9004,6 @@
         </w:tc>
       </w:tr>
       <w:tr>
-        <w:tblPrEx>
-          <w:tblCellMar>
-            <w:top w:w="0" w:type="dxa"/>
-            <w:bottom w:w="0" w:type="dxa"/>
-          </w:tblCellMar>
-        </w:tblPrEx>
         <w:tc>
           <w:tcPr>
             <w:tcW w:w="1860" w:type="dxa"/>
@@ -9580,12 +9154,6 @@
         </w:tc>
       </w:tr>
       <w:tr>
-        <w:tblPrEx>
-          <w:tblCellMar>
-            <w:top w:w="0" w:type="dxa"/>
-            <w:bottom w:w="0" w:type="dxa"/>
-          </w:tblCellMar>
-        </w:tblPrEx>
         <w:tc>
           <w:tcPr>
             <w:tcW w:w="1860" w:type="dxa"/>
@@ -9736,12 +9304,6 @@
         </w:tc>
       </w:tr>
       <w:tr>
-        <w:tblPrEx>
-          <w:tblCellMar>
-            <w:top w:w="0" w:type="dxa"/>
-            <w:bottom w:w="0" w:type="dxa"/>
-          </w:tblCellMar>
-        </w:tblPrEx>
         <w:tc>
           <w:tcPr>
             <w:tcW w:w="1860" w:type="dxa"/>
@@ -9892,12 +9454,6 @@
         </w:tc>
       </w:tr>
       <w:tr>
-        <w:tblPrEx>
-          <w:tblCellMar>
-            <w:top w:w="0" w:type="dxa"/>
-            <w:bottom w:w="0" w:type="dxa"/>
-          </w:tblCellMar>
-        </w:tblPrEx>
         <w:tc>
           <w:tcPr>
             <w:tcW w:w="1860" w:type="dxa"/>
@@ -10048,12 +9604,6 @@
         </w:tc>
       </w:tr>
       <w:tr>
-        <w:tblPrEx>
-          <w:tblCellMar>
-            <w:top w:w="0" w:type="dxa"/>
-            <w:bottom w:w="0" w:type="dxa"/>
-          </w:tblCellMar>
-        </w:tblPrEx>
         <w:tc>
           <w:tcPr>
             <w:tcW w:w="1860" w:type="dxa"/>
@@ -10187,12 +9737,6 @@
         </w:tc>
       </w:tr>
       <w:tr>
-        <w:tblPrEx>
-          <w:tblCellMar>
-            <w:top w:w="0" w:type="dxa"/>
-            <w:bottom w:w="0" w:type="dxa"/>
-          </w:tblCellMar>
-        </w:tblPrEx>
         <w:tc>
           <w:tcPr>
             <w:tcW w:w="1860" w:type="dxa"/>
@@ -10978,9 +10522,57 @@
 
 <file path=word/header1.xml><?xml version="1.0" encoding="utf-8"?>
 <w:hdr xmlns:wpc="http://schemas.microsoft.com/office/word/2010/wordprocessingCanvas" xmlns:cx="http://schemas.microsoft.com/office/drawing/2014/chartex" xmlns:cx1="http://schemas.microsoft.com/office/drawing/2015/9/8/chartex" xmlns:cx2="http://schemas.microsoft.com/office/drawing/2015/10/21/chartex" xmlns:cx3="http://schemas.microsoft.com/office/drawing/2016/5/9/chartex" xmlns:cx4="http://schemas.microsoft.com/office/drawing/2016/5/10/chartex" xmlns:cx5="http://schemas.microsoft.com/office/drawing/2016/5/11/chartex" xmlns:cx6="http://schemas.microsoft.com/office/drawing/2016/5/12/chartex" xmlns:cx7="http://schemas.microsoft.com/office/drawing/2016/5/13/chartex" xmlns:cx8="http://schemas.microsoft.com/office/drawing/2016/5/14/chartex" xmlns:mc="http://schemas.openxmlformats.org/markup-compatibility/2006" xmlns:m="http://schemas.openxmlformats.org/officeDocument/2006/math" xmlns:aink="http://schemas.microsoft.com/office/drawing/2016/ink" xmlns:am3d="http://schemas.microsoft.com/office/drawing/2017/model3d" xmlns:oel="http://schemas.microsoft.com/office/2019/extlst" xmlns:r="http://schemas.openxmlformats.org/officeDocument/2006/relationships" xmlns:wp14="http://schemas.microsoft.com/office/word/2010/wordprocessingDrawing" xmlns:wp="http://schemas.openxmlformats.org/drawingml/2006/wordprocessingDrawing" xmlns:wpg="http://schemas.microsoft.com/office/word/2010/wordprocessingGroup" xmlns:wpi="http://schemas.microsoft.com/office/word/2010/wordprocessingInk" xmlns:wps="http://schemas.microsoft.com/office/word/2010/wordprocessingShape" xmlns:o="urn:schemas-microsoft-com:office:office" xmlns:v="urn:schemas-microsoft-com:vml" xmlns:w10="urn:schemas-microsoft-com:office:word" xmlns:w="http://schemas.openxmlformats.org/wordprocessingml/2006/main" xmlns:w14="http://schemas.microsoft.com/office/word/2010/wordml" xmlns:w15="http://schemas.microsoft.com/office/word/2012/wordml" xmlns:w16cex="http://schemas.microsoft.com/office/word/2018/wordml/cex" xmlns:w16cid="http://schemas.microsoft.com/office/word/2016/wordml/cid" xmlns:w16="http://schemas.microsoft.com/office/word/2018/wordml" xmlns:w16sdtdh="http://schemas.microsoft.com/office/word/2020/wordml/sdtdatahash" xmlns:w16sdtfl="http://schemas.microsoft.com/office/word/2024/wordml/sdtformatlock" xmlns:w16se="http://schemas.microsoft.com/office/word/2015/wordml/symex" xmlns:w16du="http://schemas.microsoft.com/office/word/2023/wordml/word16du" xmlns:wne="http://schemas.microsoft.com/office/word/2006/wordml" mc:Ignorable="w14 w15 w16se w16cid w16 w16cex w16sdtdh w16sdtfl w16du wp14">
+  <w:sdt>
+    <w:sdtPr>
+      <w:rPr>
+        <w:rStyle w:val="PageNumber"/>
+      </w:rPr>
+      <w:id w:val="-1421859109"/>
+      <w:docPartObj>
+        <w:docPartGallery w:val="Page Numbers (Top of Page)"/>
+        <w:docPartUnique/>
+      </w:docPartObj>
+    </w:sdtPr>
+    <w:sdtContent>
+      <w:p>
+        <w:pPr>
+          <w:pStyle w:val="Header"/>
+          <w:framePr w:wrap="none" w:vAnchor="text" w:hAnchor="margin" w:xAlign="right" w:y="1"/>
+          <w:rPr>
+            <w:rStyle w:val="PageNumber"/>
+          </w:rPr>
+        </w:pPr>
+        <w:r>
+          <w:rPr>
+            <w:rStyle w:val="PageNumber"/>
+          </w:rPr>
+          <w:fldChar w:fldCharType="begin"/>
+        </w:r>
+        <w:r>
+          <w:rPr>
+            <w:rStyle w:val="PageNumber"/>
+          </w:rPr>
+          <w:instrText xml:space="preserve"> PAGE </w:instrText>
+        </w:r>
+        <w:r>
+          <w:rPr>
+            <w:rStyle w:val="PageNumber"/>
+          </w:rPr>
+          <w:fldChar w:fldCharType="separate"/>
+        </w:r>
+        <w:r>
+          <w:rPr>
+            <w:rStyle w:val="PageNumber"/>
+          </w:rPr>
+          <w:fldChar w:fldCharType="end"/>
+        </w:r>
+      </w:p>
+    </w:sdtContent>
+  </w:sdt>
   <w:p>
     <w:pPr>
       <w:pStyle w:val="Header"/>
+      <w:ind w:right="360"/>
     </w:pPr>
   </w:p>
 </w:hdr>
@@ -10988,9 +10580,64 @@
 
 <file path=word/header2.xml><?xml version="1.0" encoding="utf-8"?>
 <w:hdr xmlns:wpc="http://schemas.microsoft.com/office/word/2010/wordprocessingCanvas" xmlns:cx="http://schemas.microsoft.com/office/drawing/2014/chartex" xmlns:cx1="http://schemas.microsoft.com/office/drawing/2015/9/8/chartex" xmlns:cx2="http://schemas.microsoft.com/office/drawing/2015/10/21/chartex" xmlns:cx3="http://schemas.microsoft.com/office/drawing/2016/5/9/chartex" xmlns:cx4="http://schemas.microsoft.com/office/drawing/2016/5/10/chartex" xmlns:cx5="http://schemas.microsoft.com/office/drawing/2016/5/11/chartex" xmlns:cx6="http://schemas.microsoft.com/office/drawing/2016/5/12/chartex" xmlns:cx7="http://schemas.microsoft.com/office/drawing/2016/5/13/chartex" xmlns:cx8="http://schemas.microsoft.com/office/drawing/2016/5/14/chartex" xmlns:mc="http://schemas.openxmlformats.org/markup-compatibility/2006" xmlns:m="http://schemas.openxmlformats.org/officeDocument/2006/math" xmlns:aink="http://schemas.microsoft.com/office/drawing/2016/ink" xmlns:am3d="http://schemas.microsoft.com/office/drawing/2017/model3d" xmlns:oel="http://schemas.microsoft.com/office/2019/extlst" xmlns:r="http://schemas.openxmlformats.org/officeDocument/2006/relationships" xmlns:wp14="http://schemas.microsoft.com/office/word/2010/wordprocessingDrawing" xmlns:wp="http://schemas.openxmlformats.org/drawingml/2006/wordprocessingDrawing" xmlns:wpg="http://schemas.microsoft.com/office/word/2010/wordprocessingGroup" xmlns:wpi="http://schemas.microsoft.com/office/word/2010/wordprocessingInk" xmlns:wps="http://schemas.microsoft.com/office/word/2010/wordprocessingShape" xmlns:o="urn:schemas-microsoft-com:office:office" xmlns:v="urn:schemas-microsoft-com:vml" xmlns:w10="urn:schemas-microsoft-com:office:word" xmlns:w="http://schemas.openxmlformats.org/wordprocessingml/2006/main" xmlns:w14="http://schemas.microsoft.com/office/word/2010/wordml" xmlns:w15="http://schemas.microsoft.com/office/word/2012/wordml" xmlns:w16cex="http://schemas.microsoft.com/office/word/2018/wordml/cex" xmlns:w16cid="http://schemas.microsoft.com/office/word/2016/wordml/cid" xmlns:w16="http://schemas.microsoft.com/office/word/2018/wordml" xmlns:w16sdtdh="http://schemas.microsoft.com/office/word/2020/wordml/sdtdatahash" xmlns:w16sdtfl="http://schemas.microsoft.com/office/word/2024/wordml/sdtformatlock" xmlns:w16se="http://schemas.microsoft.com/office/word/2015/wordml/symex" xmlns:w16du="http://schemas.microsoft.com/office/word/2023/wordml/word16du" xmlns:wne="http://schemas.microsoft.com/office/word/2006/wordml" mc:Ignorable="w14 w15 w16se w16cid w16 w16cex w16sdtdh w16sdtfl w16du wp14">
+  <w:sdt>
+    <w:sdtPr>
+      <w:rPr>
+        <w:rStyle w:val="PageNumber"/>
+      </w:rPr>
+      <w:id w:val="1931546450"/>
+      <w:docPartObj>
+        <w:docPartGallery w:val="Page Numbers (Top of Page)"/>
+        <w:docPartUnique/>
+      </w:docPartObj>
+    </w:sdtPr>
+    <w:sdtContent>
+      <w:p>
+        <w:pPr>
+          <w:pStyle w:val="Header"/>
+          <w:framePr w:wrap="none" w:vAnchor="text" w:hAnchor="margin" w:xAlign="right" w:y="1"/>
+          <w:rPr>
+            <w:rStyle w:val="PageNumber"/>
+          </w:rPr>
+        </w:pPr>
+        <w:r>
+          <w:rPr>
+            <w:rStyle w:val="PageNumber"/>
+          </w:rPr>
+          <w:fldChar w:fldCharType="begin"/>
+        </w:r>
+        <w:r>
+          <w:rPr>
+            <w:rStyle w:val="PageNumber"/>
+          </w:rPr>
+          <w:instrText xml:space="preserve"> PAGE </w:instrText>
+        </w:r>
+        <w:r>
+          <w:rPr>
+            <w:rStyle w:val="PageNumber"/>
+          </w:rPr>
+          <w:fldChar w:fldCharType="separate"/>
+        </w:r>
+        <w:r>
+          <w:rPr>
+            <w:rStyle w:val="PageNumber"/>
+            <w:noProof/>
+          </w:rPr>
+          <w:t>1</w:t>
+        </w:r>
+        <w:r>
+          <w:rPr>
+            <w:rStyle w:val="PageNumber"/>
+          </w:rPr>
+          <w:fldChar w:fldCharType="end"/>
+        </w:r>
+      </w:p>
+    </w:sdtContent>
+  </w:sdt>
   <w:p>
     <w:pPr>
       <w:pStyle w:val="Header"/>
+      <w:ind w:right="360"/>
     </w:pPr>
   </w:p>
 </w:hdr>

</xml_diff>

<commit_message>
removed UCID number, public repo and all
</commit_message>
<xml_diff>
--- a/SENG696 - Ayah Metwali Report 1.docx
+++ b/SENG696 - Ayah Metwali Report 1.docx
@@ -10,12 +10,6 @@
     <w:p>
       <w:r>
         <w:t>Ayah Metwali</w:t>
-      </w:r>
-      <w:r>
-        <w:t>,</w:t>
-      </w:r>
-      <w:r>
-        <w:t xml:space="preserve"> 30042982</w:t>
       </w:r>
     </w:p>
     <w:p/>

</xml_diff>